<commit_message>
Resubmission with Sensitivity Analysis
</commit_message>
<xml_diff>
--- a/CodeR/Process_Causal_Discovery.docx
+++ b/CodeR/Process_Causal_Discovery.docx
@@ -46,7 +46,7 @@
         <w:br/>
       </w:r>
       <w:r>
-        <w:t xml:space="preserve">Executed: July 07, 2025</w:t>
+        <w:t xml:space="preserve">Executed: Februar 23, 2026</w:t>
       </w:r>
     </w:p>
     <w:bookmarkStart w:id="20" w:name="X4fed6699376dd54c50d09debf4bb7268be24352"/>
@@ -555,15 +555,6 @@
         <w:rPr>
           <w:rStyle w:val="VerbatimChar"/>
         </w:rPr>
-        <w:t xml:space="preserve">age -&gt; diabetes_before_migraine</w:t>
-      </w:r>
-      <w:r>
-        <w:br/>
-      </w:r>
-      <w:r>
-        <w:rPr>
-          <w:rStyle w:val="VerbatimChar"/>
-        </w:rPr>
         <w:t xml:space="preserve">age -&gt; gross_hourly_wage</w:t>
       </w:r>
       <w:r>
@@ -699,6 +690,15 @@
         <w:rPr>
           <w:rStyle w:val="VerbatimChar"/>
         </w:rPr>
+        <w:t xml:space="preserve">career_sacrifices -&gt; highest_educational_degree</w:t>
+      </w:r>
+      <w:r>
+        <w:br/>
+      </w:r>
+      <w:r>
+        <w:rPr>
+          <w:rStyle w:val="VerbatimChar"/>
+        </w:rPr>
         <w:t xml:space="preserve">career_sacrifices -&gt; migraine_incidence</w:t>
       </w:r>
       <w:r>
@@ -834,15 +834,6 @@
         <w:rPr>
           <w:rStyle w:val="VerbatimChar"/>
         </w:rPr>
-        <w:t xml:space="preserve">current_mat_parent_leave -&gt; daily_hours_childcare_weekdays</w:t>
-      </w:r>
-      <w:r>
-        <w:br/>
-      </w:r>
-      <w:r>
-        <w:rPr>
-          <w:rStyle w:val="VerbatimChar"/>
-        </w:rPr>
         <w:t xml:space="preserve">current_mat_parent_leave -&gt; gender</w:t>
       </w:r>
       <w:r>
@@ -870,15 +861,6 @@
         <w:rPr>
           <w:rStyle w:val="VerbatimChar"/>
         </w:rPr>
-        <w:t xml:space="preserve">current_monthly_gross_labor_income -&gt; gross_hourly_wage</w:t>
-      </w:r>
-      <w:r>
-        <w:br/>
-      </w:r>
-      <w:r>
-        <w:rPr>
-          <w:rStyle w:val="VerbatimChar"/>
-        </w:rPr>
         <w:t xml:space="preserve">current_monthly_gross_labor_income -&gt; work_time</w:t>
       </w:r>
       <w:r>
@@ -888,6 +870,15 @@
         <w:rPr>
           <w:rStyle w:val="VerbatimChar"/>
         </w:rPr>
+        <w:t xml:space="preserve">daily_hours_childcare_weekdays -&gt; current_mat_parent_leave</w:t>
+      </w:r>
+      <w:r>
+        <w:br/>
+      </w:r>
+      <w:r>
+        <w:rPr>
+          <w:rStyle w:val="VerbatimChar"/>
+        </w:rPr>
         <w:t xml:space="preserve">daily_hours_childcare_weekdays -&gt; gender</w:t>
       </w:r>
       <w:r>
@@ -1059,7 +1050,7 @@
         <w:rPr>
           <w:rStyle w:val="VerbatimChar"/>
         </w:rPr>
-        <w:t xml:space="preserve">east_german_residence -&gt; felt_discriminated_gender_12mo</w:t>
+        <w:t xml:space="preserve">east_german_residence -&gt; felt_discriminated_ethnic_12mo</w:t>
       </w:r>
       <w:r>
         <w:br/>
@@ -1086,6 +1077,15 @@
         <w:rPr>
           <w:rStyle w:val="VerbatimChar"/>
         </w:rPr>
+        <w:t xml:space="preserve">east_german_residence -&gt; hypertension_before_migraine</w:t>
+      </w:r>
+      <w:r>
+        <w:br/>
+      </w:r>
+      <w:r>
+        <w:rPr>
+          <w:rStyle w:val="VerbatimChar"/>
+        </w:rPr>
         <w:t xml:space="preserve">east_german_residence -&gt; migraine</w:t>
       </w:r>
       <w:r>
@@ -1104,15 +1104,6 @@
         <w:rPr>
           <w:rStyle w:val="VerbatimChar"/>
         </w:rPr>
-        <w:t xml:space="preserve">east_german_residence -&gt; risk_taking_health_scale</w:t>
-      </w:r>
-      <w:r>
-        <w:br/>
-      </w:r>
-      <w:r>
-        <w:rPr>
-          <w:rStyle w:val="VerbatimChar"/>
-        </w:rPr>
         <w:t xml:space="preserve">east_german_residence -&gt; sex_entry_change</w:t>
       </w:r>
       <w:r>
@@ -1212,6 +1203,15 @@
         <w:rPr>
           <w:rStyle w:val="VerbatimChar"/>
         </w:rPr>
+        <w:t xml:space="preserve">felt_discriminated_ethnic_12mo -&gt; diabetes_before_migraine</w:t>
+      </w:r>
+      <w:r>
+        <w:br/>
+      </w:r>
+      <w:r>
+        <w:rPr>
+          <w:rStyle w:val="VerbatimChar"/>
+        </w:rPr>
         <w:t xml:space="preserve">felt_discriminated_ethnic_12mo -&gt; highest_educational_degree</w:t>
       </w:r>
       <w:r>
@@ -1221,6 +1221,15 @@
         <w:rPr>
           <w:rStyle w:val="VerbatimChar"/>
         </w:rPr>
+        <w:t xml:space="preserve">felt_discriminated_ethnic_12mo -&gt; migraine</w:t>
+      </w:r>
+      <w:r>
+        <w:br/>
+      </w:r>
+      <w:r>
+        <w:rPr>
+          <w:rStyle w:val="VerbatimChar"/>
+        </w:rPr>
         <w:t xml:space="preserve">felt_discriminated_ethnic_12mo -&gt; migraine_incidence</w:t>
       </w:r>
       <w:r>
@@ -1302,15 +1311,6 @@
         <w:rPr>
           <w:rStyle w:val="VerbatimChar"/>
         </w:rPr>
-        <w:t xml:space="preserve">felt_discriminated_gender_12mo -&gt; daily_hours_childcare_weekdays</w:t>
-      </w:r>
-      <w:r>
-        <w:br/>
-      </w:r>
-      <w:r>
-        <w:rPr>
-          <w:rStyle w:val="VerbatimChar"/>
-        </w:rPr>
         <w:t xml:space="preserve">felt_discriminated_gender_12mo -&gt; felt_discriminated_ethnic_12mo</w:t>
       </w:r>
       <w:r>
@@ -1365,6 +1365,15 @@
         <w:rPr>
           <w:rStyle w:val="VerbatimChar"/>
         </w:rPr>
+        <w:t xml:space="preserve">felt_discriminated_gender_12mo -&gt; self_esteem</w:t>
+      </w:r>
+      <w:r>
+        <w:br/>
+      </w:r>
+      <w:r>
+        <w:rPr>
+          <w:rStyle w:val="VerbatimChar"/>
+        </w:rPr>
         <w:t xml:space="preserve">felt_discriminated_gender_12mo -&gt; stroke</w:t>
       </w:r>
       <w:r>
@@ -1482,6 +1491,15 @@
         <w:rPr>
           <w:rStyle w:val="VerbatimChar"/>
         </w:rPr>
+        <w:t xml:space="preserve">gross_hourly_wage -&gt; current_monthly_gross_labor_income</w:t>
+      </w:r>
+      <w:r>
+        <w:br/>
+      </w:r>
+      <w:r>
+        <w:rPr>
+          <w:rStyle w:val="VerbatimChar"/>
+        </w:rPr>
         <w:t xml:space="preserve">gross_hourly_wage -&gt; gender</w:t>
       </w:r>
       <w:r>
@@ -1725,6 +1743,15 @@
         <w:rPr>
           <w:rStyle w:val="VerbatimChar"/>
         </w:rPr>
+        <w:t xml:space="preserve">immigration_history -&gt; refugee_exp</w:t>
+      </w:r>
+      <w:r>
+        <w:br/>
+      </w:r>
+      <w:r>
+        <w:rPr>
+          <w:rStyle w:val="VerbatimChar"/>
+        </w:rPr>
         <w:t xml:space="preserve">immigration_history -&gt; sex_entry_change</w:t>
       </w:r>
       <w:r>
@@ -1815,6 +1842,15 @@
         <w:rPr>
           <w:rStyle w:val="VerbatimChar"/>
         </w:rPr>
+        <w:t xml:space="preserve">migraine -&gt; hypertension_before_migraine</w:t>
+      </w:r>
+      <w:r>
+        <w:br/>
+      </w:r>
+      <w:r>
+        <w:rPr>
+          <w:rStyle w:val="VerbatimChar"/>
+        </w:rPr>
         <w:t xml:space="preserve">migraine -&gt; migraine_incidence</w:t>
       </w:r>
       <w:r>
@@ -2085,15 +2121,6 @@
         <w:rPr>
           <w:rStyle w:val="VerbatimChar"/>
         </w:rPr>
-        <w:t xml:space="preserve">refugee_exp -&gt; east_german_residence</w:t>
-      </w:r>
-      <w:r>
-        <w:br/>
-      </w:r>
-      <w:r>
-        <w:rPr>
-          <w:rStyle w:val="VerbatimChar"/>
-        </w:rPr>
         <w:t xml:space="preserve">refugee_exp -&gt; felt_discriminated_ethnic_12mo</w:t>
       </w:r>
       <w:r>
@@ -2247,6 +2274,15 @@
         <w:rPr>
           <w:rStyle w:val="VerbatimChar"/>
         </w:rPr>
+        <w:t xml:space="preserve">risk_taking_driving_scale -&gt; working_overtime</w:t>
+      </w:r>
+      <w:r>
+        <w:br/>
+      </w:r>
+      <w:r>
+        <w:rPr>
+          <w:rStyle w:val="VerbatimChar"/>
+        </w:rPr>
         <w:t xml:space="preserve">risk_taking_health_scale -&gt; age</w:t>
       </w:r>
       <w:r>
@@ -2526,15 +2562,6 @@
         <w:rPr>
           <w:rStyle w:val="VerbatimChar"/>
         </w:rPr>
-        <w:t xml:space="preserve">sex_binary -&gt; risk_taking_health_scale</w:t>
-      </w:r>
-      <w:r>
-        <w:br/>
-      </w:r>
-      <w:r>
-        <w:rPr>
-          <w:rStyle w:val="VerbatimChar"/>
-        </w:rPr>
         <w:t xml:space="preserve">sex_binary -&gt; self_esteem</w:t>
       </w:r>
       <w:r>
@@ -2571,6 +2598,15 @@
         <w:rPr>
           <w:rStyle w:val="VerbatimChar"/>
         </w:rPr>
+        <w:t xml:space="preserve">sex_entry_change -&gt; career_sacrifices</w:t>
+      </w:r>
+      <w:r>
+        <w:br/>
+      </w:r>
+      <w:r>
+        <w:rPr>
+          <w:rStyle w:val="VerbatimChar"/>
+        </w:rPr>
         <w:t xml:space="preserve">sex_entry_change -&gt; daily_hours_housework_weekdays</w:t>
       </w:r>
       <w:r>
@@ -2617,15 +2653,6 @@
           <w:rStyle w:val="VerbatimChar"/>
         </w:rPr>
         <w:t xml:space="preserve">sex_entry_change -&gt; migraine</w:t>
-      </w:r>
-      <w:r>
-        <w:br/>
-      </w:r>
-      <w:r>
-        <w:rPr>
-          <w:rStyle w:val="VerbatimChar"/>
-        </w:rPr>
-        <w:t xml:space="preserve">sex_entry_change -&gt; num_children_in_household</w:t>
       </w:r>
       <w:r>
         <w:br/>
@@ -3195,6 +3222,17 @@
         <w:rPr>
           <w:rStyle w:val="VerbatimChar"/>
         </w:rPr>
+        <w:t xml:space="preserve">Warning in log(det(s)): NaNs wurden erzeugt</w:t>
+      </w:r>
+    </w:p>
+    <w:p>
+      <w:pPr>
+        <w:pStyle w:val="SourceCode"/>
+      </w:pPr>
+      <w:r>
+        <w:rPr>
+          <w:rStyle w:val="VerbatimChar"/>
+        </w:rPr>
         <w:t xml:space="preserve">[1] "DAG (flexCItwd)"</w:t>
       </w:r>
     </w:p>
@@ -4253,11 +4291,15 @@
         <w:rPr>
           <w:rStyle w:val="VerbatimChar"/>
         </w:rPr>
-        <w:t xml:space="preserve">Time difference of 9.861352 hours</w:t>
+        <w:t xml:space="preserve">Time difference of 6.515061 hours</w:t>
       </w:r>
     </w:p>
     <w:bookmarkEnd w:id="23"/>
-    <w:sectPr/>
+    <w:sectPr>
+      <w:footnotePr>
+        <w:numRestart w:val="eachSect"/>
+      </w:footnotePr>
+    </w:sectPr>
   </w:body>
 </w:document>
 </file>
@@ -4429,8 +4471,6 @@
     </w:pPr>
     <w:rPr>
       <w:rFonts w:asciiTheme="majorHAnsi" w:cstheme="majorBidi" w:eastAsiaTheme="majorEastAsia" w:hAnsiTheme="majorHAnsi"/>
-      <w:spacing w:val="-10"/>
-      <w:kern w:val="28"/>
       <w:sz w:val="56"/>
       <w:szCs w:val="56"/>
     </w:rPr>
@@ -4443,8 +4483,6 @@
     <w:rsid w:val="00A10FD9"/>
     <w:rPr>
       <w:rFonts w:asciiTheme="majorHAnsi" w:cstheme="majorBidi" w:eastAsiaTheme="majorEastAsia" w:hAnsiTheme="majorHAnsi"/>
-      <w:spacing w:val="-10"/>
-      <w:kern w:val="28"/>
       <w:sz w:val="56"/>
       <w:szCs w:val="56"/>
     </w:rPr>
@@ -4485,23 +4523,31 @@
   </w:style>
   <w:style w:customStyle="1" w:styleId="Author" w:type="paragraph">
     <w:name w:val="Author"/>
+    <w:basedOn w:val="Title"/>
     <w:next w:val="BodyText"/>
     <w:qFormat/>
     <w:pPr>
       <w:keepNext/>
       <w:keepLines/>
-      <w:jc w:val="center"/>
     </w:pPr>
+    <w:rPr>
+      <w:sz w:val="24"/>
+      <w:szCs w:val="24"/>
+    </w:rPr>
   </w:style>
   <w:style w:styleId="Date" w:type="paragraph">
     <w:name w:val="Date"/>
+    <w:basedOn w:val="Title"/>
     <w:next w:val="BodyText"/>
     <w:qFormat/>
     <w:pPr>
       <w:keepNext/>
       <w:keepLines/>
-      <w:jc w:val="center"/>
     </w:pPr>
+    <w:rPr>
+      <w:sz w:val="24"/>
+      <w:szCs w:val="24"/>
+    </w:rPr>
   </w:style>
   <w:style w:customStyle="1" w:styleId="AbstractTitle" w:type="paragraph">
     <w:name w:val="Abstract Title"/>
@@ -5597,8 +5643,8 @@
 </file>
 
 <file path=customXml/item1.xml><?xml version="1.0" encoding="utf-8"?>
-<ct:contentTypeSchema xmlns:ct="http://schemas.microsoft.com/office/2006/metadata/contentType" xmlns:ma="http://schemas.microsoft.com/office/2006/metadata/properties/metaAttributes" ct:_="" ma:_="" ma:contentTypeName="Document" ma:contentTypeID="0x01010038EC001EAF619D4C9DA16715C5227D79" ma:contentTypeVersion="11" ma:contentTypeDescription="Create a new document." ma:contentTypeScope="" ma:versionID="e907f32a0c1207c859ebb11d2da383e5">
-  <xsd:schema xmlns:xsd="http://www.w3.org/2001/XMLSchema" xmlns:xs="http://www.w3.org/2001/XMLSchema" xmlns:p="http://schemas.microsoft.com/office/2006/metadata/properties" xmlns:ns2="a02994ae-d6cf-450e-85c4-1140a79b423c" xmlns:ns3="f2cd2d01-df26-4de2-9efd-040a549e2429" targetNamespace="http://schemas.microsoft.com/office/2006/metadata/properties" ma:root="true" ma:fieldsID="9aedcbda70484b030deb52034458199f" ns2:_="" ns3:_="">
+<ct:contentTypeSchema xmlns:ct="http://schemas.microsoft.com/office/2006/metadata/contentType" xmlns:ma="http://schemas.microsoft.com/office/2006/metadata/properties/metaAttributes" ct:_="" ma:_="" ma:contentTypeName="Dokument" ma:contentTypeID="0x01010038EC001EAF619D4C9DA16715C5227D79" ma:contentTypeVersion="11" ma:contentTypeDescription="Ein neues Dokument erstellen." ma:contentTypeScope="" ma:versionID="00fd4fb9eb1eca07335e62117045beef">
+  <xsd:schema xmlns:xsd="http://www.w3.org/2001/XMLSchema" xmlns:xs="http://www.w3.org/2001/XMLSchema" xmlns:p="http://schemas.microsoft.com/office/2006/metadata/properties" xmlns:ns2="a02994ae-d6cf-450e-85c4-1140a79b423c" xmlns:ns3="f2cd2d01-df26-4de2-9efd-040a549e2429" targetNamespace="http://schemas.microsoft.com/office/2006/metadata/properties" ma:root="true" ma:fieldsID="fac7404f9703a8d434256a624133560e" ns2:_="" ns3:_="">
     <xsd:import namespace="a02994ae-d6cf-450e-85c4-1140a79b423c"/>
     <xsd:import namespace="f2cd2d01-df26-4de2-9efd-040a549e2429"/>
     <xsd:element name="properties">
@@ -5647,7 +5693,7 @@
         <xsd:restriction base="dms:Text"/>
       </xsd:simpleType>
     </xsd:element>
-    <xsd:element name="lcf76f155ced4ddcb4097134ff3c332f" ma:index="13" nillable="true" ma:taxonomy="true" ma:internalName="lcf76f155ced4ddcb4097134ff3c332f" ma:taxonomyFieldName="MediaServiceImageTags" ma:displayName="Image Tags" ma:readOnly="false" ma:fieldId="{5cf76f15-5ced-4ddc-b409-7134ff3c332f}" ma:taxonomyMulti="true" ma:sspId="2375ea7b-1eef-4e91-915e-32e4cb5a9c34" ma:termSetId="09814cd3-568e-fe90-9814-8d621ff8fb84" ma:anchorId="fba54fb3-c3e1-fe81-a776-ca4b69148c4d" ma:open="true" ma:isKeyword="false">
+    <xsd:element name="lcf76f155ced4ddcb4097134ff3c332f" ma:index="13" nillable="true" ma:taxonomy="true" ma:internalName="lcf76f155ced4ddcb4097134ff3c332f" ma:taxonomyFieldName="MediaServiceImageTags" ma:displayName="Bildmarkierungen" ma:readOnly="false" ma:fieldId="{5cf76f15-5ced-4ddc-b409-7134ff3c332f}" ma:taxonomyMulti="true" ma:sspId="2375ea7b-1eef-4e91-915e-32e4cb5a9c34" ma:termSetId="09814cd3-568e-fe90-9814-8d621ff8fb84" ma:anchorId="fba54fb3-c3e1-fe81-a776-ca4b69148c4d" ma:open="true" ma:isKeyword="false">
       <xsd:complexType>
         <xsd:sequence>
           <xsd:element ref="pc:Terms" minOccurs="0" maxOccurs="1"/>
@@ -5701,8 +5747,8 @@
         <xsd:element ref="dc:creator" minOccurs="0" maxOccurs="1"/>
         <xsd:element ref="dcterms:created" minOccurs="0" maxOccurs="1"/>
         <xsd:element ref="dc:identifier" minOccurs="0" maxOccurs="1"/>
-        <xsd:element name="contentType" minOccurs="0" maxOccurs="1" type="xsd:string" ma:index="0" ma:displayName="Content Type"/>
-        <xsd:element ref="dc:title" minOccurs="0" maxOccurs="1" ma:index="4" ma:displayName="Title"/>
+        <xsd:element name="contentType" minOccurs="0" maxOccurs="1" type="xsd:string" ma:index="0" ma:displayName="Inhaltstyp"/>
+        <xsd:element ref="dc:title" minOccurs="0" maxOccurs="1" ma:index="4" ma:displayName="Titel"/>
         <xsd:element ref="dc:subject" minOccurs="0" maxOccurs="1"/>
         <xsd:element ref="dc:description" minOccurs="0" maxOccurs="1"/>
         <xsd:element name="keywords" minOccurs="0" maxOccurs="1" type="xsd:string"/>
@@ -5812,13 +5858,13 @@
 </file>
 
 <file path=customXml/itemProps1.xml><?xml version="1.0" encoding="utf-8"?>
-<ds:datastoreItem xmlns:ds="http://schemas.openxmlformats.org/officeDocument/2006/customXml" ds:itemID="{68466660-00A9-4E8A-BF15-FE37BC4179BC}"/>
+<ds:datastoreItem xmlns:ds="http://schemas.openxmlformats.org/officeDocument/2006/customXml" ds:itemID="{543232F4-D63E-4A9C-97B5-3277F3485E99}"/>
 </file>
 
 <file path=customXml/itemProps2.xml><?xml version="1.0" encoding="utf-8"?>
-<ds:datastoreItem xmlns:ds="http://schemas.openxmlformats.org/officeDocument/2006/customXml" ds:itemID="{A940EF48-FB55-4766-96E3-7E633F383D55}"/>
+<ds:datastoreItem xmlns:ds="http://schemas.openxmlformats.org/officeDocument/2006/customXml" ds:itemID="{AF665B14-E420-4412-AB19-802689D6F5FA}"/>
 </file>
 
 <file path=customXml/itemProps3.xml><?xml version="1.0" encoding="utf-8"?>
-<ds:datastoreItem xmlns:ds="http://schemas.openxmlformats.org/officeDocument/2006/customXml" ds:itemID="{6FC14B7D-FC22-4B6A-893E-88C303B50A72}"/>
+<ds:datastoreItem xmlns:ds="http://schemas.openxmlformats.org/officeDocument/2006/customXml" ds:itemID="{FA70E674-4819-457E-89A5-9F2C35DAB380}"/>
 </file>
</xml_diff>

<commit_message>
Added SEM for unimputed data
</commit_message>
<xml_diff>
--- a/CodeR/Process_Causal_Discovery.docx
+++ b/CodeR/Process_Causal_Discovery.docx
@@ -46,10 +46,10 @@
         <w:br/>
       </w:r>
       <w:r>
-        <w:t xml:space="preserve">Executed: Februar 23, 2026</w:t>
+        <w:t xml:space="preserve">Executed: April 23, 2026</w:t>
       </w:r>
     </w:p>
-    <w:bookmarkStart w:id="20" w:name="X4fed6699376dd54c50d09debf4bb7268be24352"/>
+    <w:bookmarkStart w:id="9" w:name="X4fed6699376dd54c50d09debf4bb7268be24352"/>
     <w:p>
       <w:pPr>
         <w:pStyle w:val="Heading2"/>
@@ -58,8 +58,8 @@
         <w:t xml:space="preserve">Load: SEM Domain Knowledge Model, Preprocessed Data</w:t>
       </w:r>
     </w:p>
-    <w:bookmarkEnd w:id="20"/>
-    <w:bookmarkStart w:id="21" w:name="causal-discovery-continuous-imputed-data"/>
+    <w:bookmarkEnd w:id="9"/>
+    <w:bookmarkStart w:id="10" w:name="causal-discovery-continuous-imputed-data"/>
     <w:p>
       <w:pPr>
         <w:pStyle w:val="Heading2"/>
@@ -555,6 +555,15 @@
         <w:rPr>
           <w:rStyle w:val="VerbatimChar"/>
         </w:rPr>
+        <w:t xml:space="preserve">age -&gt; diabetes_before_migraine</w:t>
+      </w:r>
+      <w:r>
+        <w:br/>
+      </w:r>
+      <w:r>
+        <w:rPr>
+          <w:rStyle w:val="VerbatimChar"/>
+        </w:rPr>
         <w:t xml:space="preserve">age -&gt; gross_hourly_wage</w:t>
       </w:r>
       <w:r>
@@ -1050,15 +1059,6 @@
         <w:rPr>
           <w:rStyle w:val="VerbatimChar"/>
         </w:rPr>
-        <w:t xml:space="preserve">east_german_residence -&gt; felt_discriminated_ethnic_12mo</w:t>
-      </w:r>
-      <w:r>
-        <w:br/>
-      </w:r>
-      <w:r>
-        <w:rPr>
-          <w:rStyle w:val="VerbatimChar"/>
-        </w:rPr>
         <w:t xml:space="preserve">east_german_residence -&gt; gross_hourly_wage</w:t>
       </w:r>
       <w:r>
@@ -1104,6 +1104,15 @@
         <w:rPr>
           <w:rStyle w:val="VerbatimChar"/>
         </w:rPr>
+        <w:t xml:space="preserve">east_german_residence -&gt; risk_taking_health_scale</w:t>
+      </w:r>
+      <w:r>
+        <w:br/>
+      </w:r>
+      <w:r>
+        <w:rPr>
+          <w:rStyle w:val="VerbatimChar"/>
+        </w:rPr>
         <w:t xml:space="preserve">east_german_residence -&gt; sex_entry_change</w:t>
       </w:r>
       <w:r>
@@ -1203,15 +1212,6 @@
         <w:rPr>
           <w:rStyle w:val="VerbatimChar"/>
         </w:rPr>
-        <w:t xml:space="preserve">felt_discriminated_ethnic_12mo -&gt; diabetes_before_migraine</w:t>
-      </w:r>
-      <w:r>
-        <w:br/>
-      </w:r>
-      <w:r>
-        <w:rPr>
-          <w:rStyle w:val="VerbatimChar"/>
-        </w:rPr>
         <w:t xml:space="preserve">felt_discriminated_ethnic_12mo -&gt; highest_educational_degree</w:t>
       </w:r>
       <w:r>
@@ -1221,15 +1221,6 @@
         <w:rPr>
           <w:rStyle w:val="VerbatimChar"/>
         </w:rPr>
-        <w:t xml:space="preserve">felt_discriminated_ethnic_12mo -&gt; migraine</w:t>
-      </w:r>
-      <w:r>
-        <w:br/>
-      </w:r>
-      <w:r>
-        <w:rPr>
-          <w:rStyle w:val="VerbatimChar"/>
-        </w:rPr>
         <w:t xml:space="preserve">felt_discriminated_ethnic_12mo -&gt; migraine_incidence</w:t>
       </w:r>
       <w:r>
@@ -1239,15 +1230,6 @@
         <w:rPr>
           <w:rStyle w:val="VerbatimChar"/>
         </w:rPr>
-        <w:t xml:space="preserve">felt_discriminated_ethnic_12mo -&gt; self_esteem</w:t>
-      </w:r>
-      <w:r>
-        <w:br/>
-      </w:r>
-      <w:r>
-        <w:rPr>
-          <w:rStyle w:val="VerbatimChar"/>
-        </w:rPr>
         <w:t xml:space="preserve">felt_discriminated_ethnic_12mo -&gt; stroke</w:t>
       </w:r>
       <w:r>
@@ -1689,15 +1671,6 @@
         <w:rPr>
           <w:rStyle w:val="VerbatimChar"/>
         </w:rPr>
-        <w:t xml:space="preserve">immigration_history -&gt; career_sacrifices</w:t>
-      </w:r>
-      <w:r>
-        <w:br/>
-      </w:r>
-      <w:r>
-        <w:rPr>
-          <w:rStyle w:val="VerbatimChar"/>
-        </w:rPr>
         <w:t xml:space="preserve">immigration_history -&gt; east_german_residence</w:t>
       </w:r>
       <w:r>
@@ -1752,15 +1725,6 @@
         <w:rPr>
           <w:rStyle w:val="VerbatimChar"/>
         </w:rPr>
-        <w:t xml:space="preserve">immigration_history -&gt; sex_entry_change</w:t>
-      </w:r>
-      <w:r>
-        <w:br/>
-      </w:r>
-      <w:r>
-        <w:rPr>
-          <w:rStyle w:val="VerbatimChar"/>
-        </w:rPr>
         <w:t xml:space="preserve">leadership_position -&gt; alcohol_consumption</w:t>
       </w:r>
       <w:r>
@@ -1779,6 +1743,15 @@
         <w:rPr>
           <w:rStyle w:val="VerbatimChar"/>
         </w:rPr>
+        <w:t xml:space="preserve">leadership_position -&gt; current_life_satisfaction_scale</w:t>
+      </w:r>
+      <w:r>
+        <w:br/>
+      </w:r>
+      <w:r>
+        <w:rPr>
+          <w:rStyle w:val="VerbatimChar"/>
+        </w:rPr>
         <w:t xml:space="preserve">leadership_position -&gt; current_monthly_gross_labor_income</w:t>
       </w:r>
       <w:r>
@@ -1842,15 +1815,6 @@
         <w:rPr>
           <w:rStyle w:val="VerbatimChar"/>
         </w:rPr>
-        <w:t xml:space="preserve">migraine -&gt; hypertension_before_migraine</w:t>
-      </w:r>
-      <w:r>
-        <w:br/>
-      </w:r>
-      <w:r>
-        <w:rPr>
-          <w:rStyle w:val="VerbatimChar"/>
-        </w:rPr>
         <w:t xml:space="preserve">migraine -&gt; migraine_incidence</w:t>
       </w:r>
       <w:r>
@@ -2121,6 +2085,15 @@
         <w:rPr>
           <w:rStyle w:val="VerbatimChar"/>
         </w:rPr>
+        <w:t xml:space="preserve">refugee_exp -&gt; east_german_residence</w:t>
+      </w:r>
+      <w:r>
+        <w:br/>
+      </w:r>
+      <w:r>
+        <w:rPr>
+          <w:rStyle w:val="VerbatimChar"/>
+        </w:rPr>
         <w:t xml:space="preserve">refugee_exp -&gt; felt_discriminated_ethnic_12mo</w:t>
       </w:r>
       <w:r>
@@ -2292,15 +2265,6 @@
         <w:rPr>
           <w:rStyle w:val="VerbatimChar"/>
         </w:rPr>
-        <w:t xml:space="preserve">risk_taking_health_scale -&gt; alcohol_consumption</w:t>
-      </w:r>
-      <w:r>
-        <w:br/>
-      </w:r>
-      <w:r>
-        <w:rPr>
-          <w:rStyle w:val="VerbatimChar"/>
-        </w:rPr>
         <w:t xml:space="preserve">risk_taking_health_scale -&gt; num_physician_visits</w:t>
       </w:r>
       <w:r>
@@ -2589,24 +2553,6 @@
         <w:rPr>
           <w:rStyle w:val="VerbatimChar"/>
         </w:rPr>
-        <w:t xml:space="preserve">sex_entry_change -&gt; alcohol_consumption</w:t>
-      </w:r>
-      <w:r>
-        <w:br/>
-      </w:r>
-      <w:r>
-        <w:rPr>
-          <w:rStyle w:val="VerbatimChar"/>
-        </w:rPr>
-        <w:t xml:space="preserve">sex_entry_change -&gt; career_sacrifices</w:t>
-      </w:r>
-      <w:r>
-        <w:br/>
-      </w:r>
-      <w:r>
-        <w:rPr>
-          <w:rStyle w:val="VerbatimChar"/>
-        </w:rPr>
         <w:t xml:space="preserve">sex_entry_change -&gt; daily_hours_housework_weekdays</w:t>
       </w:r>
       <w:r>
@@ -2661,6 +2607,24 @@
         <w:rPr>
           <w:rStyle w:val="VerbatimChar"/>
         </w:rPr>
+        <w:t xml:space="preserve">sex_entry_change -&gt; num_children_in_household</w:t>
+      </w:r>
+      <w:r>
+        <w:br/>
+      </w:r>
+      <w:r>
+        <w:rPr>
+          <w:rStyle w:val="VerbatimChar"/>
+        </w:rPr>
+        <w:t xml:space="preserve">sex_entry_change -&gt; risk_taking_driving_scale</w:t>
+      </w:r>
+      <w:r>
+        <w:br/>
+      </w:r>
+      <w:r>
+        <w:rPr>
+          <w:rStyle w:val="VerbatimChar"/>
+        </w:rPr>
         <w:t xml:space="preserve">sex_entry_change -&gt; risk_taking_scale</w:t>
       </w:r>
       <w:r>
@@ -2688,6 +2652,15 @@
         <w:rPr>
           <w:rStyle w:val="VerbatimChar"/>
         </w:rPr>
+        <w:t xml:space="preserve">sex_entry_change -&gt; using_period_of_care</w:t>
+      </w:r>
+      <w:r>
+        <w:br/>
+      </w:r>
+      <w:r>
+        <w:rPr>
+          <w:rStyle w:val="VerbatimChar"/>
+        </w:rPr>
         <w:t xml:space="preserve">sex_or -&gt; age</w:t>
       </w:r>
       <w:r>
@@ -2958,15 +2931,6 @@
         <w:rPr>
           <w:rStyle w:val="VerbatimChar"/>
         </w:rPr>
-        <w:t xml:space="preserve">using_period_of_care -&gt; work_time</w:t>
-      </w:r>
-      <w:r>
-        <w:br/>
-      </w:r>
-      <w:r>
-        <w:rPr>
-          <w:rStyle w:val="VerbatimChar"/>
-        </w:rPr>
         <w:t xml:space="preserve">using_period_of_care -&gt; worried_health</w:t>
       </w:r>
       <w:r>
@@ -3204,8 +3168,8 @@
         <w:t xml:space="preserve">}</w:t>
       </w:r>
     </w:p>
-    <w:bookmarkEnd w:id="21"/>
-    <w:bookmarkStart w:id="22" w:name="causal-discovery-categorical-raw-data"/>
+    <w:bookmarkEnd w:id="10"/>
+    <w:bookmarkStart w:id="11" w:name="causal-discovery-categorical-raw-data"/>
     <w:p>
       <w:pPr>
         <w:pStyle w:val="Heading2"/>
@@ -4273,8 +4237,8 @@
         <w:t xml:space="preserve">}</w:t>
       </w:r>
     </w:p>
-    <w:bookmarkEnd w:id="22"/>
-    <w:bookmarkStart w:id="23" w:name="done"/>
+    <w:bookmarkEnd w:id="11"/>
+    <w:bookmarkStart w:id="12" w:name="done"/>
     <w:p>
       <w:pPr>
         <w:pStyle w:val="Heading2"/>
@@ -4291,10 +4255,10 @@
         <w:rPr>
           <w:rStyle w:val="VerbatimChar"/>
         </w:rPr>
-        <w:t xml:space="preserve">Time difference of 6.515061 hours</w:t>
+        <w:t xml:space="preserve">Time difference of 6.011433 hours</w:t>
       </w:r>
     </w:p>
-    <w:bookmarkEnd w:id="23"/>
+    <w:bookmarkEnd w:id="12"/>
     <w:sectPr>
       <w:footnotePr>
         <w:numRestart w:val="eachSect"/>
@@ -4416,10 +4380,10 @@
   <w:docDefaults>
     <w:rPrDefault>
       <w:rPr>
-        <w:rFonts w:asciiTheme="minorHAnsi" w:cstheme="minorBidi" w:eastAsiaTheme="minorHAnsi" w:hAnsiTheme="minorHAnsi"/>
+        <w:rFonts w:asciiTheme="minorHAnsi" w:cstheme="minorBidi" w:eastAsiaTheme="minorEastAsia" w:hAnsiTheme="minorHAnsi"/>
         <w:sz w:val="24"/>
         <w:szCs w:val="24"/>
-        <w:lang w:bidi="ar-SA" w:eastAsia="en-US" w:val="en-US"/>
+        <w:lang w:bidi="ar-SA" w:eastAsia="zh-CN" w:val="en-US"/>
       </w:rPr>
     </w:rPrDefault>
     <w:pPrDefault>
@@ -4960,13 +4924,6 @@
       </w:tblCellMar>
     </w:tblPr>
     <w:tblStylePr w:type="firstRow">
-      <w:tblPr>
-        <w:jc w:val="left"/>
-        <w:tblInd w:type="dxa" w:w="0"/>
-      </w:tblPr>
-      <w:trPr>
-        <w:jc w:val="left"/>
-      </w:trPr>
       <w:tcPr>
         <w:tcBorders>
           <w:bottom w:val="single"/>
@@ -5643,8 +5600,8 @@
 </file>
 
 <file path=customXml/item1.xml><?xml version="1.0" encoding="utf-8"?>
-<ct:contentTypeSchema xmlns:ct="http://schemas.microsoft.com/office/2006/metadata/contentType" xmlns:ma="http://schemas.microsoft.com/office/2006/metadata/properties/metaAttributes" ct:_="" ma:_="" ma:contentTypeName="Dokument" ma:contentTypeID="0x01010038EC001EAF619D4C9DA16715C5227D79" ma:contentTypeVersion="11" ma:contentTypeDescription="Ein neues Dokument erstellen." ma:contentTypeScope="" ma:versionID="00fd4fb9eb1eca07335e62117045beef">
-  <xsd:schema xmlns:xsd="http://www.w3.org/2001/XMLSchema" xmlns:xs="http://www.w3.org/2001/XMLSchema" xmlns:p="http://schemas.microsoft.com/office/2006/metadata/properties" xmlns:ns2="a02994ae-d6cf-450e-85c4-1140a79b423c" xmlns:ns3="f2cd2d01-df26-4de2-9efd-040a549e2429" targetNamespace="http://schemas.microsoft.com/office/2006/metadata/properties" ma:root="true" ma:fieldsID="fac7404f9703a8d434256a624133560e" ns2:_="" ns3:_="">
+<ct:contentTypeSchema xmlns:ct="http://schemas.microsoft.com/office/2006/metadata/contentType" xmlns:ma="http://schemas.microsoft.com/office/2006/metadata/properties/metaAttributes" ct:_="" ma:_="" ma:contentTypeName="Document" ma:contentTypeID="0x01010038EC001EAF619D4C9DA16715C5227D79" ma:contentTypeVersion="11" ma:contentTypeDescription="Create a new document." ma:contentTypeScope="" ma:versionID="5d6120b33aa634161f7aa60d34be3c44">
+  <xsd:schema xmlns:xsd="http://www.w3.org/2001/XMLSchema" xmlns:xs="http://www.w3.org/2001/XMLSchema" xmlns:p="http://schemas.microsoft.com/office/2006/metadata/properties" xmlns:ns2="a02994ae-d6cf-450e-85c4-1140a79b423c" xmlns:ns3="f2cd2d01-df26-4de2-9efd-040a549e2429" targetNamespace="http://schemas.microsoft.com/office/2006/metadata/properties" ma:root="true" ma:fieldsID="eb3cc5489c60abd71f646ad20615129b" ns2:_="" ns3:_="">
     <xsd:import namespace="a02994ae-d6cf-450e-85c4-1140a79b423c"/>
     <xsd:import namespace="f2cd2d01-df26-4de2-9efd-040a549e2429"/>
     <xsd:element name="properties">
@@ -5693,7 +5650,7 @@
         <xsd:restriction base="dms:Text"/>
       </xsd:simpleType>
     </xsd:element>
-    <xsd:element name="lcf76f155ced4ddcb4097134ff3c332f" ma:index="13" nillable="true" ma:taxonomy="true" ma:internalName="lcf76f155ced4ddcb4097134ff3c332f" ma:taxonomyFieldName="MediaServiceImageTags" ma:displayName="Bildmarkierungen" ma:readOnly="false" ma:fieldId="{5cf76f15-5ced-4ddc-b409-7134ff3c332f}" ma:taxonomyMulti="true" ma:sspId="2375ea7b-1eef-4e91-915e-32e4cb5a9c34" ma:termSetId="09814cd3-568e-fe90-9814-8d621ff8fb84" ma:anchorId="fba54fb3-c3e1-fe81-a776-ca4b69148c4d" ma:open="true" ma:isKeyword="false">
+    <xsd:element name="lcf76f155ced4ddcb4097134ff3c332f" ma:index="13" nillable="true" ma:taxonomy="true" ma:internalName="lcf76f155ced4ddcb4097134ff3c332f" ma:taxonomyFieldName="MediaServiceImageTags" ma:displayName="Image Tags" ma:readOnly="false" ma:fieldId="{5cf76f15-5ced-4ddc-b409-7134ff3c332f}" ma:taxonomyMulti="true" ma:sspId="2375ea7b-1eef-4e91-915e-32e4cb5a9c34" ma:termSetId="09814cd3-568e-fe90-9814-8d621ff8fb84" ma:anchorId="fba54fb3-c3e1-fe81-a776-ca4b69148c4d" ma:open="true" ma:isKeyword="false">
       <xsd:complexType>
         <xsd:sequence>
           <xsd:element ref="pc:Terms" minOccurs="0" maxOccurs="1"/>
@@ -5747,8 +5704,8 @@
         <xsd:element ref="dc:creator" minOccurs="0" maxOccurs="1"/>
         <xsd:element ref="dcterms:created" minOccurs="0" maxOccurs="1"/>
         <xsd:element ref="dc:identifier" minOccurs="0" maxOccurs="1"/>
-        <xsd:element name="contentType" minOccurs="0" maxOccurs="1" type="xsd:string" ma:index="0" ma:displayName="Inhaltstyp"/>
-        <xsd:element ref="dc:title" minOccurs="0" maxOccurs="1" ma:index="4" ma:displayName="Titel"/>
+        <xsd:element name="contentType" minOccurs="0" maxOccurs="1" type="xsd:string" ma:index="0" ma:displayName="Content Type"/>
+        <xsd:element ref="dc:title" minOccurs="0" maxOccurs="1" ma:index="4" ma:displayName="Title"/>
         <xsd:element ref="dc:subject" minOccurs="0" maxOccurs="1"/>
         <xsd:element ref="dc:description" minOccurs="0" maxOccurs="1"/>
         <xsd:element name="keywords" minOccurs="0" maxOccurs="1" type="xsd:string"/>
@@ -5858,13 +5815,13 @@
 </file>
 
 <file path=customXml/itemProps1.xml><?xml version="1.0" encoding="utf-8"?>
-<ds:datastoreItem xmlns:ds="http://schemas.openxmlformats.org/officeDocument/2006/customXml" ds:itemID="{543232F4-D63E-4A9C-97B5-3277F3485E99}"/>
+<ds:datastoreItem xmlns:ds="http://schemas.openxmlformats.org/officeDocument/2006/customXml" ds:itemID="{F1AB27B2-B1BA-4A6C-98E2-6B2890628E38}"/>
 </file>
 
 <file path=customXml/itemProps2.xml><?xml version="1.0" encoding="utf-8"?>
-<ds:datastoreItem xmlns:ds="http://schemas.openxmlformats.org/officeDocument/2006/customXml" ds:itemID="{AF665B14-E420-4412-AB19-802689D6F5FA}"/>
+<ds:datastoreItem xmlns:ds="http://schemas.openxmlformats.org/officeDocument/2006/customXml" ds:itemID="{5F72A33A-4A60-4D28-8E43-FD2EF069389F}"/>
 </file>
 
 <file path=customXml/itemProps3.xml><?xml version="1.0" encoding="utf-8"?>
-<ds:datastoreItem xmlns:ds="http://schemas.openxmlformats.org/officeDocument/2006/customXml" ds:itemID="{FA70E674-4819-457E-89A5-9F2C35DAB380}"/>
+<ds:datastoreItem xmlns:ds="http://schemas.openxmlformats.org/officeDocument/2006/customXml" ds:itemID="{423EF6B0-F284-47ED-ABBA-68F845EA3044}"/>
 </file>
</xml_diff>